<commit_message>
modifiche requisiti e aggiunta diagramma di flusso
</commit_message>
<xml_diff>
--- a/docs/specificaReqSnake.docx
+++ b/docs/specificaReqSnake.docx
@@ -1018,16 +1018,11 @@
       <w:pPr>
         <w:rPr/>
       </w:pPr>
-      <w:commentRangeStart w:id="1"/>
       <w:r>
         <w:rPr>
           <w:rtl w:val="0"/>
         </w:rPr>
         <w:t xml:space="preserve">Necessario lo sviluppo di un modulo di intermezzo che metta in comunicazione il gioco di Snake e l’AI, trasformando gli input in un formato leggibile da un modulo all’altro.</w:t>
-      </w:r>
-      <w:commentRangeEnd w:id="1"/>
-      <w:r>
-        <w:commentReference w:id="1"/>
       </w:r>
       <w:r>
         <w:rPr>
@@ -1194,7 +1189,7 @@
           <w:ilvl w:val="0"/>
           <w:numId w:val="4"/>
         </w:numPr>
-        <w:ind w:left="720" w:hanging="360"/>
+        <w:ind w:left="720" w:hanging="649.1338582677165"/>
       </w:pPr>
       <w:r>
         <w:rPr>
@@ -1209,7 +1204,7 @@
           <w:ilvl w:val="0"/>
           <w:numId w:val="4"/>
         </w:numPr>
-        <w:ind w:left="720" w:hanging="360"/>
+        <w:ind w:left="720" w:hanging="649.1338582677165"/>
         <w:rPr>
           <w:u w:val="none"/>
         </w:rPr>
@@ -1227,7 +1222,7 @@
           <w:ilvl w:val="0"/>
           <w:numId w:val="4"/>
         </w:numPr>
-        <w:ind w:left="720" w:hanging="360"/>
+        <w:ind w:left="720" w:hanging="649.1338582677165"/>
       </w:pPr>
       <w:r>
         <w:rPr>
@@ -1242,7 +1237,7 @@
           <w:ilvl w:val="0"/>
           <w:numId w:val="4"/>
         </w:numPr>
-        <w:ind w:left="720" w:hanging="360"/>
+        <w:ind w:left="720" w:hanging="649.1338582677165"/>
         <w:rPr>
           <w:u w:val="none"/>
         </w:rPr>
@@ -1260,7 +1255,7 @@
           <w:ilvl w:val="0"/>
           <w:numId w:val="4"/>
         </w:numPr>
-        <w:ind w:left="720" w:hanging="360"/>
+        <w:ind w:left="720" w:hanging="649.1338582677165"/>
       </w:pPr>
       <w:r>
         <w:rPr>
@@ -1275,7 +1270,7 @@
           <w:ilvl w:val="0"/>
           <w:numId w:val="4"/>
         </w:numPr>
-        <w:ind w:left="720" w:hanging="360"/>
+        <w:ind w:left="720" w:hanging="649.1338582677165"/>
         <w:rPr>
           <w:u w:val="none"/>
         </w:rPr>
@@ -1293,7 +1288,7 @@
           <w:ilvl w:val="0"/>
           <w:numId w:val="4"/>
         </w:numPr>
-        <w:ind w:left="720" w:hanging="360"/>
+        <w:ind w:left="720" w:hanging="649.1338582677165"/>
         <w:rPr>
           <w:u w:val="none"/>
         </w:rPr>
@@ -1311,7 +1306,7 @@
           <w:ilvl w:val="0"/>
           <w:numId w:val="4"/>
         </w:numPr>
-        <w:ind w:left="720" w:hanging="360"/>
+        <w:ind w:left="720" w:hanging="649.1338582677165"/>
         <w:rPr>
           <w:u w:val="none"/>
         </w:rPr>
@@ -1329,7 +1324,7 @@
           <w:ilvl w:val="0"/>
           <w:numId w:val="4"/>
         </w:numPr>
-        <w:ind w:left="720" w:hanging="360"/>
+        <w:ind w:left="720" w:hanging="649.1338582677165"/>
         <w:rPr>
           <w:u w:val="none"/>
         </w:rPr>
@@ -1370,7 +1365,7 @@
           <w:ilvl w:val="0"/>
           <w:numId w:val="4"/>
         </w:numPr>
-        <w:ind w:left="720" w:hanging="360"/>
+        <w:ind w:left="720" w:hanging="649.1338582677165"/>
         <w:rPr>
           <w:u w:val="none"/>
         </w:rPr>
@@ -1388,7 +1383,54 @@
           <w:ilvl w:val="0"/>
           <w:numId w:val="4"/>
         </w:numPr>
-        <w:ind w:left="720" w:hanging="360"/>
+        <w:ind w:left="720" w:hanging="649.1338582677165"/>
+        <w:rPr>
+          <w:u w:val="none"/>
+        </w:rPr>
+      </w:pPr>
+      <w:commentRangeStart w:id="1"/>
+      <w:r>
+        <w:rPr>
+          <w:rtl w:val="0"/>
+        </w:rPr>
+        <w:t xml:space="preserve">L’interprete capirà la disposizione dei vari elementi (mela, muro, corpo) tramite un calcolo di rette e vettori che indicano la distanza tra la testa e questi element</w:t>
+      </w:r>
+      <w:commentRangeEnd w:id="1"/>
+      <w:r>
+        <w:commentReference w:id="1"/>
+      </w:r>
+      <w:r>
+        <w:rPr>
+          <w:rtl w:val="0"/>
+        </w:rPr>
+        <w:t xml:space="preserve">i.</w:t>
+      </w:r>
+    </w:p>
+    <w:p>
+      <w:pPr>
+        <w:numPr>
+          <w:ilvl w:val="0"/>
+          <w:numId w:val="4"/>
+        </w:numPr>
+        <w:ind w:left="720" w:hanging="649.1338582677165"/>
+        <w:rPr>
+          <w:u w:val="none"/>
+        </w:rPr>
+      </w:pPr>
+      <w:r>
+        <w:rPr>
+          <w:rtl w:val="0"/>
+        </w:rPr>
+        <w:t xml:space="preserve">L’interprete definisce un numero finito di rette che utilizzerà per passare in input all’intelligenza la distanza calcolata in precedenza</w:t>
+      </w:r>
+    </w:p>
+    <w:p>
+      <w:pPr>
+        <w:numPr>
+          <w:ilvl w:val="0"/>
+          <w:numId w:val="4"/>
+        </w:numPr>
+        <w:ind w:left="720" w:hanging="649.1338582677165"/>
         <w:rPr>
           <w:u w:val="none"/>
         </w:rPr>
@@ -1398,7 +1440,7 @@
         <w:rPr>
           <w:rtl w:val="0"/>
         </w:rPr>
-        <w:t xml:space="preserve">L’interprete capirà la disposizione dei vari elementi (mela, muro, corpo) tramite un calcolo di rette e vettori che indicano la distanza tra la testa e questi element</w:t>
+        <w:t xml:space="preserve">L’interprete gestisce la policy con cui dare reward alla AI: piccoli reward se l’azione dell’AI ha diminuito la distanza della testa alla mela, bassissimi reward se l’azione ha causato la fine della partita e altissimi reward se l’azione ha fatto allungare il corpo dello snake.</w:t>
       </w:r>
       <w:commentRangeEnd w:id="2"/>
       <w:r>
@@ -1408,7 +1450,6 @@
         <w:rPr>
           <w:rtl w:val="0"/>
         </w:rPr>
-        <w:t xml:space="preserve">i.</w:t>
       </w:r>
     </w:p>
     <w:p>
@@ -1417,16 +1458,40 @@
           <w:ilvl w:val="0"/>
           <w:numId w:val="4"/>
         </w:numPr>
-        <w:ind w:left="720" w:hanging="360"/>
-        <w:rPr>
-          <w:u w:val="none"/>
-        </w:rPr>
-      </w:pPr>
-      <w:r>
-        <w:rPr>
-          <w:rtl w:val="0"/>
-        </w:rPr>
-        <w:t xml:space="preserve">L’interprete definisce un numero finito di rette che utilizzerà per passare in input all’intelligenza la distanza calcolata in precedenza</w:t>
+        <w:ind w:left="720" w:hanging="649.1338582677165"/>
+        <w:rPr>
+          <w:u w:val="none"/>
+        </w:rPr>
+      </w:pPr>
+      <w:r>
+        <w:rPr>
+          <w:rtl w:val="0"/>
+        </w:rPr>
+        <w:t xml:space="preserve">l’interprete gestisce la comunicazione tra i thread AI e di gioco.</w:t>
+      </w:r>
+    </w:p>
+    <w:p>
+      <w:pPr>
+        <w:ind w:left="0" w:firstLine="70.86614173228355"/>
+        <w:rPr/>
+      </w:pPr>
+      <w:r>
+        <w:rPr>
+          <w:rtl w:val="0"/>
+        </w:rPr>
+        <w:tab/>
+      </w:r>
+    </w:p>
+    <w:p>
+      <w:pPr>
+        <w:ind w:left="720" w:hanging="649.1338582677165"/>
+        <w:rPr/>
+      </w:pPr>
+      <w:r>
+        <w:rPr>
+          <w:rtl w:val="0"/>
+        </w:rPr>
+        <w:t xml:space="preserve">Statistiche :</w:t>
       </w:r>
     </w:p>
     <w:p>
@@ -1435,17 +1500,15 @@
           <w:ilvl w:val="0"/>
           <w:numId w:val="4"/>
         </w:numPr>
-        <w:ind w:left="720" w:hanging="360"/>
-        <w:rPr>
-          <w:u w:val="none"/>
-        </w:rPr>
+        <w:ind w:left="720" w:hanging="649.1338582677165"/>
+        <w:rPr/>
       </w:pPr>
       <w:commentRangeStart w:id="3"/>
       <w:r>
         <w:rPr>
           <w:rtl w:val="0"/>
         </w:rPr>
-        <w:t xml:space="preserve">L’interprete gestisce la policy con cui dare reward alla AI: piccoli reward se l’azione dell’AI ha diminuito la distanza della testa alla mela, bassissimi reward se l’azione ha causato la fine della partita e altissimi reward se l’azione ha fatto allungare il corpo dello snake.</w:t>
+        <w:t xml:space="preserve">Elaborare </w:t>
       </w:r>
       <w:commentRangeEnd w:id="3"/>
       <w:r>
@@ -1455,6 +1518,427 @@
         <w:rPr>
           <w:rtl w:val="0"/>
         </w:rPr>
+        <w:t xml:space="preserve">delle statistiche di gioco</w:t>
+      </w:r>
+    </w:p>
+    <w:p>
+      <w:pPr>
+        <w:ind w:left="720" w:firstLine="0"/>
+        <w:rPr/>
+      </w:pPr>
+      <w:r>
+        <w:rPr>
+          <w:rtl w:val="0"/>
+        </w:rPr>
+      </w:r>
+    </w:p>
+    <w:p>
+      <w:pPr>
+        <w:ind w:left="720" w:firstLine="0"/>
+        <w:rPr/>
+      </w:pPr>
+      <w:r>
+        <w:rPr>
+          <w:rtl w:val="0"/>
+        </w:rPr>
+        <w:t xml:space="preserve">AI :</w:t>
+      </w:r>
+    </w:p>
+    <w:p>
+      <w:pPr>
+        <w:numPr>
+          <w:ilvl w:val="0"/>
+          <w:numId w:val="4"/>
+        </w:numPr>
+        <w:ind w:left="720" w:hanging="649.1338582677165"/>
+        <w:rPr>
+          <w:u w:val="none"/>
+        </w:rPr>
+      </w:pPr>
+      <w:r>
+        <w:rPr>
+          <w:rtl w:val="0"/>
+        </w:rPr>
+        <w:t xml:space="preserve">La quantità di layer e loro personalizzazione deve essere inserito nella sua inizializzazione</w:t>
+      </w:r>
+    </w:p>
+    <w:p>
+      <w:pPr>
+        <w:numPr>
+          <w:ilvl w:val="0"/>
+          <w:numId w:val="4"/>
+        </w:numPr>
+        <w:ind w:left="720" w:hanging="649.1338582677165"/>
+        <w:rPr>
+          <w:u w:val="none"/>
+        </w:rPr>
+      </w:pPr>
+      <w:r>
+        <w:rPr>
+          <w:rtl w:val="0"/>
+        </w:rPr>
+        <w:t xml:space="preserve">Il funzionamento dei neuroni seguirà la formula </w:t>
+      </w:r>
+      <w:commentRangeStart w:id="4"/>
+      <w:r>
+        <w:rPr>
+          <w:rtl w:val="0"/>
+        </w:rPr>
+        <w:t xml:space="preserve">X</w:t>
+      </w:r>
+      <w:commentRangeEnd w:id="4"/>
+      <w:r>
+        <w:commentReference w:id="4"/>
+      </w:r>
+      <w:r>
+        <w:rPr>
+          <w:rtl w:val="0"/>
+        </w:rPr>
+        <w:t xml:space="preserve"> nella fase di front-propagation.</w:t>
+      </w:r>
+    </w:p>
+    <w:p>
+      <w:pPr>
+        <w:numPr>
+          <w:ilvl w:val="0"/>
+          <w:numId w:val="4"/>
+        </w:numPr>
+        <w:ind w:left="720" w:hanging="649.1338582677165"/>
+        <w:rPr>
+          <w:u w:val="none"/>
+        </w:rPr>
+      </w:pPr>
+      <w:r>
+        <w:rPr>
+          <w:rtl w:val="0"/>
+        </w:rPr>
+        <w:t xml:space="preserve">Dopo ogni azione ci sarà la fase di back-propagation usando formula </w:t>
+      </w:r>
+      <w:commentRangeStart w:id="5"/>
+      <w:r>
+        <w:rPr>
+          <w:rtl w:val="0"/>
+        </w:rPr>
+        <w:t xml:space="preserve">Y</w:t>
+      </w:r>
+      <w:commentRangeEnd w:id="5"/>
+      <w:r>
+        <w:commentReference w:id="5"/>
+      </w:r>
+      <w:r>
+        <w:rPr>
+          <w:rtl w:val="0"/>
+        </w:rPr>
+        <w:t xml:space="preserve">.</w:t>
+      </w:r>
+    </w:p>
+    <w:p>
+      <w:pPr>
+        <w:numPr>
+          <w:ilvl w:val="0"/>
+          <w:numId w:val="4"/>
+        </w:numPr>
+        <w:ind w:left="720" w:hanging="649.1338582677165"/>
+        <w:rPr>
+          <w:u w:val="none"/>
+        </w:rPr>
+      </w:pPr>
+      <w:r>
+        <w:rPr>
+          <w:rtl w:val="0"/>
+        </w:rPr>
+        <w:t xml:space="preserve">Dai neuroni di output verranno calcolate le probabilità di ogni azione usando una </w:t>
+      </w:r>
+      <w:commentRangeStart w:id="6"/>
+      <w:r>
+        <w:rPr>
+          <w:rtl w:val="0"/>
+        </w:rPr>
+        <w:t xml:space="preserve">formula.</w:t>
+      </w:r>
+      <w:commentRangeEnd w:id="6"/>
+      <w:r>
+        <w:commentReference w:id="6"/>
+      </w:r>
+      <w:r>
+        <w:rPr>
+          <w:rtl w:val="0"/>
+        </w:rPr>
+        <w:t xml:space="preserve"> </w:t>
+      </w:r>
+    </w:p>
+    <w:p>
+      <w:pPr>
+        <w:numPr>
+          <w:ilvl w:val="0"/>
+          <w:numId w:val="4"/>
+        </w:numPr>
+        <w:ind w:left="720" w:hanging="649.1338582677165"/>
+        <w:rPr>
+          <w:u w:val="none"/>
+        </w:rPr>
+      </w:pPr>
+      <w:r>
+        <w:rPr>
+          <w:rtl w:val="0"/>
+        </w:rPr>
+        <w:t xml:space="preserve">La scelta dell’azione verrà scelta casualmente usando le probabilità delle azioni.</w:t>
+      </w:r>
+    </w:p>
+    <w:p>
+      <w:pPr>
+        <w:numPr>
+          <w:ilvl w:val="0"/>
+          <w:numId w:val="4"/>
+        </w:numPr>
+        <w:ind w:left="720" w:hanging="649.1338582677165"/>
+        <w:rPr>
+          <w:u w:val="none"/>
+        </w:rPr>
+      </w:pPr>
+      <w:r>
+        <w:rPr>
+          <w:rtl w:val="0"/>
+        </w:rPr>
+        <w:t xml:space="preserve">Iterare più volte istanze di gioco per l’addestramento dell’AI</w:t>
+      </w:r>
+    </w:p>
+    <w:p>
+      <w:pPr>
+        <w:numPr>
+          <w:ilvl w:val="0"/>
+          <w:numId w:val="4"/>
+        </w:numPr>
+        <w:ind w:left="720" w:hanging="649.1338582677165"/>
+        <w:rPr>
+          <w:u w:val="none"/>
+        </w:rPr>
+      </w:pPr>
+      <w:r>
+        <w:rPr>
+          <w:rtl w:val="0"/>
+        </w:rPr>
+        <w:t xml:space="preserve">Per rendere l’esecuzione dell’allenamento più veloce, si può dare la possibilità di non visualizzare la mappa di gioco</w:t>
+      </w:r>
+    </w:p>
+    <w:p>
+      <w:pPr>
+        <w:numPr>
+          <w:ilvl w:val="0"/>
+          <w:numId w:val="4"/>
+        </w:numPr>
+        <w:ind w:left="720" w:hanging="649.1338582677165"/>
+        <w:rPr>
+          <w:u w:val="none"/>
+        </w:rPr>
+      </w:pPr>
+      <w:r>
+        <w:rPr>
+          <w:rtl w:val="0"/>
+        </w:rPr>
+        <w:t xml:space="preserve">Salvare il modello con i pesi e bias dell’AI attraverso file JSON, dopo un totale di 5 back propagation</w:t>
+      </w:r>
+    </w:p>
+    <w:p>
+      <w:pPr>
+        <w:numPr>
+          <w:ilvl w:val="0"/>
+          <w:numId w:val="4"/>
+        </w:numPr>
+        <w:ind w:left="720" w:hanging="649.1338582677165"/>
+        <w:rPr>
+          <w:u w:val="none"/>
+        </w:rPr>
+      </w:pPr>
+      <w:r>
+        <w:rPr>
+          <w:rtl w:val="0"/>
+        </w:rPr>
+        <w:t xml:space="preserve">una funzione di attivazione è uguale per tutti i nodi nel layer</w:t>
+      </w:r>
+    </w:p>
+    <w:p>
+      <w:pPr>
+        <w:ind w:left="720" w:firstLine="0"/>
+        <w:rPr/>
+      </w:pPr>
+      <w:r>
+        <w:rPr>
+          <w:rtl w:val="0"/>
+        </w:rPr>
+      </w:r>
+    </w:p>
+    <w:p>
+      <w:pPr>
+        <w:ind w:left="720" w:firstLine="0"/>
+        <w:rPr/>
+      </w:pPr>
+      <w:r>
+        <w:rPr>
+          <w:rtl w:val="0"/>
+        </w:rPr>
+        <w:t xml:space="preserve">PPO:</w:t>
+      </w:r>
+    </w:p>
+    <w:p>
+      <w:pPr>
+        <w:numPr>
+          <w:ilvl w:val="0"/>
+          <w:numId w:val="4"/>
+        </w:numPr>
+        <w:ind w:left="720" w:hanging="649.1338582677165"/>
+        <w:rPr>
+          <w:u w:val="none"/>
+        </w:rPr>
+      </w:pPr>
+      <w:r>
+        <w:rPr>
+          <w:rtl w:val="0"/>
+        </w:rPr>
+        <w:t xml:space="preserve">L’AI verrà allenata usando l’algoritmo PPO.</w:t>
+      </w:r>
+    </w:p>
+    <w:p>
+      <w:pPr>
+        <w:numPr>
+          <w:ilvl w:val="0"/>
+          <w:numId w:val="4"/>
+        </w:numPr>
+        <w:ind w:left="720" w:hanging="649.1338582677165"/>
+        <w:rPr>
+          <w:u w:val="none"/>
+        </w:rPr>
+      </w:pPr>
+      <w:r>
+        <w:rPr>
+          <w:rtl w:val="0"/>
+        </w:rPr>
+        <w:t xml:space="preserve">Si deve avere la possibilità di istanziare più AI che possano giocare a più partite di Snake contemporaneamente e che modificano contemporaneamente i pesi per tutti. Così facendo, il processo di allenamento viene accelerato.</w:t>
+      </w:r>
+    </w:p>
+    <w:p>
+      <w:pPr>
+        <w:numPr>
+          <w:ilvl w:val="0"/>
+          <w:numId w:val="4"/>
+        </w:numPr>
+        <w:ind w:left="720" w:hanging="649.1338582677165"/>
+      </w:pPr>
+      <w:r>
+        <w:rPr>
+          <w:rtl w:val="0"/>
+        </w:rPr>
+        <w:t xml:space="preserve">L’AI avrà due set di neuroni di input. Uno riceve in input i valori delle rette che si scontrano con il corpo e/o il muro (aree che deve evitare). L’altro set riceverà i valori delle rette che si scontrano con la mela (area che vuole raggiungere)</w:t>
+      </w:r>
+    </w:p>
+    <w:p>
+      <w:pPr>
+        <w:numPr>
+          <w:ilvl w:val="0"/>
+          <w:numId w:val="4"/>
+        </w:numPr>
+        <w:ind w:left="720" w:hanging="649.1338582677165"/>
+        <w:rPr>
+          <w:u w:val="none"/>
+        </w:rPr>
+      </w:pPr>
+      <w:r>
+        <w:rPr>
+          <w:rtl w:val="0"/>
+        </w:rPr>
+        <w:t xml:space="preserve">L’actor avrà come output le probabilità di ogni azione dello snake, il critic invece un neurone che indichi l’approssimazione della funzione di valutazione.</w:t>
+      </w:r>
+    </w:p>
+    <w:p>
+      <w:pPr>
+        <w:ind w:left="720" w:firstLine="0"/>
+        <w:rPr/>
+      </w:pPr>
+      <w:r>
+        <w:rPr>
+          <w:rtl w:val="0"/>
+        </w:rPr>
+      </w:r>
+    </w:p>
+    <w:p>
+      <w:pPr>
+        <w:ind w:left="720" w:firstLine="0"/>
+        <w:rPr/>
+      </w:pPr>
+      <w:r>
+        <w:rPr>
+          <w:rtl w:val="0"/>
+        </w:rPr>
+        <w:t xml:space="preserve">Interfaccia:</w:t>
+      </w:r>
+    </w:p>
+    <w:p>
+      <w:pPr>
+        <w:numPr>
+          <w:ilvl w:val="0"/>
+          <w:numId w:val="4"/>
+        </w:numPr>
+        <w:ind w:left="720" w:hanging="649.1338582677165"/>
+      </w:pPr>
+      <w:r>
+        <w:rPr>
+          <w:rtl w:val="0"/>
+        </w:rPr>
+        <w:t xml:space="preserve">Permettere di inserire comandi prima dell’allenamento dell’AI (inserire i valori dei hyperparametri, comando per rendere visibile/non visibile la mappal), necessario creare un box per i prompt.</w:t>
+      </w:r>
+    </w:p>
+    <w:p>
+      <w:pPr>
+        <w:numPr>
+          <w:ilvl w:val="0"/>
+          <w:numId w:val="4"/>
+        </w:numPr>
+        <w:ind w:left="720" w:hanging="649.1338582677165"/>
+        <w:rPr>
+          <w:u w:val="none"/>
+        </w:rPr>
+      </w:pPr>
+      <w:r>
+        <w:rPr>
+          <w:rtl w:val="0"/>
+        </w:rPr>
+        <w:t xml:space="preserve">Cambiare da fase training/learning (fase in cui l’AI apprende, avvengono la front e la back propagation) a fase execution (fase in cui gioca) e viceversa. Durante il cambio fase avviene il salvataggio dello stato attuale dell’apprendimento dell’AI (ovvero del modulo).</w:t>
+      </w:r>
+    </w:p>
+    <w:p>
+      <w:pPr>
+        <w:numPr>
+          <w:ilvl w:val="0"/>
+          <w:numId w:val="4"/>
+        </w:numPr>
+        <w:ind w:left="720" w:hanging="649.1338582677165"/>
+        <w:rPr>
+          <w:u w:val="none"/>
+        </w:rPr>
+      </w:pPr>
+      <w:r>
+        <w:rPr>
+          <w:rtl w:val="0"/>
+        </w:rPr>
+        <w:t xml:space="preserve">Presentare tutte le statistiche (durata di una partita e lunghezza del corpo di snake, reward) dell’AI.</w:t>
+      </w:r>
+    </w:p>
+    <w:p>
+      <w:pPr>
+        <w:numPr>
+          <w:ilvl w:val="0"/>
+          <w:numId w:val="4"/>
+        </w:numPr>
+        <w:ind w:left="720" w:hanging="649.1338582677165"/>
+        <w:rPr>
+          <w:u w:val="none"/>
+        </w:rPr>
+      </w:pPr>
+      <w:r>
+        <w:rPr>
+          <w:rtl w:val="0"/>
+        </w:rPr>
+        <w:t xml:space="preserve">Durante la fase di training/learning si può decidere di non vedere la mappa oppure di renderizzarne una a caso tra i thread che stanno facendo training. Si permette di cambiare il thread scelto durante la fase di training. Durante la fase di esecuzione, si vede la mappa senza la possibilità di nasconderla</w:t>
       </w:r>
     </w:p>
     <w:p>
@@ -1466,323 +1950,63 @@
         <w:rPr>
           <w:rtl w:val="0"/>
         </w:rPr>
-        <w:tab/>
-      </w:r>
-    </w:p>
-    <w:p>
-      <w:pPr>
-        <w:ind w:left="720" w:firstLine="0"/>
-        <w:rPr/>
-      </w:pPr>
-      <w:r>
-        <w:rPr>
-          <w:rtl w:val="0"/>
-        </w:rPr>
-        <w:t xml:space="preserve">Statistiche :</w:t>
-      </w:r>
-    </w:p>
-    <w:p>
-      <w:pPr>
-        <w:numPr>
-          <w:ilvl w:val="0"/>
-          <w:numId w:val="4"/>
-        </w:numPr>
-        <w:ind w:left="720" w:hanging="360"/>
-        <w:rPr/>
-      </w:pPr>
-      <w:r>
-        <w:rPr>
-          <w:rtl w:val="0"/>
-        </w:rPr>
-        <w:t xml:space="preserve">Elaborare delle statistiche di gioco</w:t>
-      </w:r>
-    </w:p>
-    <w:p>
-      <w:pPr>
-        <w:numPr>
-          <w:ilvl w:val="0"/>
-          <w:numId w:val="4"/>
-        </w:numPr>
-        <w:ind w:left="720" w:hanging="360"/>
-        <w:rPr/>
-      </w:pPr>
-      <w:r>
-        <w:rPr>
-          <w:rtl w:val="0"/>
-        </w:rPr>
-        <w:t xml:space="preserve">Presentare tutte le statistiche (esempio durata di una partita e lunghezza del corpo di snake, reward) di gioco e di accuratezza dell’AI (cross entropy)</w:t>
-      </w:r>
-    </w:p>
-    <w:p>
-      <w:pPr>
-        <w:ind w:left="720" w:firstLine="0"/>
-        <w:rPr/>
-      </w:pPr>
-      <w:r>
-        <w:rPr>
-          <w:rtl w:val="0"/>
-        </w:rPr>
-      </w:r>
-    </w:p>
-    <w:p>
-      <w:pPr>
-        <w:ind w:left="720" w:firstLine="0"/>
-        <w:rPr/>
-      </w:pPr>
-      <w:r>
-        <w:rPr>
-          <w:rtl w:val="0"/>
-        </w:rPr>
-        <w:t xml:space="preserve">AI :</w:t>
-      </w:r>
-    </w:p>
-    <w:p>
-      <w:pPr>
-        <w:numPr>
-          <w:ilvl w:val="0"/>
-          <w:numId w:val="4"/>
-        </w:numPr>
-        <w:ind w:left="720" w:hanging="360"/>
-        <w:rPr>
-          <w:u w:val="none"/>
-        </w:rPr>
-      </w:pPr>
-      <w:r>
-        <w:rPr>
-          <w:rtl w:val="0"/>
-        </w:rPr>
-        <w:t xml:space="preserve">L’AI avrà due set di neuroni di input. Uno riceve in input i valori delle rette che si scontrano con il corpo e/o il muro (aree che deve evitare). L’altro set riceverà i valori delle rette che si scontrano con la mela (area che vuole raggiungere)</w:t>
-      </w:r>
-    </w:p>
-    <w:p>
-      <w:pPr>
-        <w:numPr>
-          <w:ilvl w:val="0"/>
-          <w:numId w:val="4"/>
-        </w:numPr>
-        <w:ind w:left="720" w:hanging="360"/>
-        <w:rPr>
-          <w:u w:val="none"/>
-        </w:rPr>
-      </w:pPr>
-      <w:r>
-        <w:rPr>
-          <w:rtl w:val="0"/>
-        </w:rPr>
-        <w:t xml:space="preserve">Ci saranno un totale di 4 layer intermedi</w:t>
-      </w:r>
-    </w:p>
-    <w:p>
-      <w:pPr>
-        <w:numPr>
-          <w:ilvl w:val="0"/>
-          <w:numId w:val="4"/>
-        </w:numPr>
-        <w:ind w:left="720" w:hanging="360"/>
-        <w:rPr>
-          <w:u w:val="none"/>
-        </w:rPr>
-      </w:pPr>
-      <w:r>
-        <w:rPr>
-          <w:rtl w:val="0"/>
-        </w:rPr>
-        <w:t xml:space="preserve">Il funzionamento dei neuroni seguirà la formula </w:t>
-      </w:r>
-      <w:commentRangeStart w:id="4"/>
-      <w:r>
-        <w:rPr>
-          <w:rtl w:val="0"/>
-        </w:rPr>
-        <w:t xml:space="preserve">X</w:t>
-      </w:r>
-      <w:commentRangeEnd w:id="4"/>
-      <w:r>
-        <w:commentReference w:id="4"/>
-      </w:r>
-      <w:r>
-        <w:rPr>
-          <w:rtl w:val="0"/>
-        </w:rPr>
-        <w:t xml:space="preserve"> nella fase di front-propagation.</w:t>
-      </w:r>
-    </w:p>
-    <w:p>
-      <w:pPr>
-        <w:numPr>
-          <w:ilvl w:val="0"/>
-          <w:numId w:val="4"/>
-        </w:numPr>
-        <w:ind w:left="720" w:hanging="360"/>
-        <w:rPr>
-          <w:u w:val="none"/>
-        </w:rPr>
-      </w:pPr>
-      <w:r>
-        <w:rPr>
-          <w:rtl w:val="0"/>
-        </w:rPr>
-        <w:t xml:space="preserve">Dopo ogni azione ci sarà la fase di back-propagation usando formula </w:t>
-      </w:r>
-      <w:commentRangeStart w:id="5"/>
-      <w:r>
-        <w:rPr>
-          <w:rtl w:val="0"/>
-        </w:rPr>
-        <w:t xml:space="preserve">Y</w:t>
-      </w:r>
-      <w:commentRangeEnd w:id="5"/>
-      <w:r>
-        <w:commentReference w:id="5"/>
-      </w:r>
-      <w:r>
-        <w:rPr>
-          <w:rtl w:val="0"/>
-        </w:rPr>
-        <w:t xml:space="preserve">.</w:t>
-      </w:r>
-    </w:p>
-    <w:p>
-      <w:pPr>
-        <w:numPr>
-          <w:ilvl w:val="0"/>
-          <w:numId w:val="4"/>
-        </w:numPr>
-        <w:ind w:left="720" w:hanging="360"/>
-        <w:rPr>
-          <w:u w:val="none"/>
-        </w:rPr>
-      </w:pPr>
-      <w:r>
-        <w:rPr>
-          <w:rtl w:val="0"/>
-        </w:rPr>
-        <w:t xml:space="preserve">Dai neuroni di output verranno calcolate le probabilità di ogni azione usando una </w:t>
-      </w:r>
-      <w:commentRangeStart w:id="6"/>
-      <w:r>
-        <w:rPr>
-          <w:rtl w:val="0"/>
-        </w:rPr>
-        <w:t xml:space="preserve">formula.</w:t>
-      </w:r>
-      <w:commentRangeEnd w:id="6"/>
-      <w:r>
-        <w:commentReference w:id="6"/>
-      </w:r>
-      <w:r>
-        <w:rPr>
-          <w:rtl w:val="0"/>
-        </w:rPr>
-        <w:t xml:space="preserve"> </w:t>
-      </w:r>
-    </w:p>
-    <w:p>
-      <w:pPr>
-        <w:numPr>
-          <w:ilvl w:val="0"/>
-          <w:numId w:val="4"/>
-        </w:numPr>
-        <w:ind w:left="720" w:hanging="360"/>
-        <w:rPr>
-          <w:u w:val="none"/>
-        </w:rPr>
-      </w:pPr>
-      <w:r>
-        <w:rPr>
-          <w:rtl w:val="0"/>
-        </w:rPr>
-        <w:t xml:space="preserve">La scelta dell’azione verrà scelta casualmente usando le probabilità delle azioni.</w:t>
-      </w:r>
-    </w:p>
-    <w:p>
-      <w:pPr>
-        <w:numPr>
-          <w:ilvl w:val="0"/>
-          <w:numId w:val="4"/>
-        </w:numPr>
-        <w:ind w:left="720" w:hanging="360"/>
-        <w:rPr>
-          <w:u w:val="none"/>
-        </w:rPr>
-      </w:pPr>
-      <w:r>
-        <w:rPr>
-          <w:rtl w:val="0"/>
-        </w:rPr>
-        <w:t xml:space="preserve">Iterare più volte istanze di gioco per l’addestramento dell’AI</w:t>
-      </w:r>
-    </w:p>
-    <w:p>
-      <w:pPr>
-        <w:numPr>
-          <w:ilvl w:val="0"/>
-          <w:numId w:val="4"/>
-        </w:numPr>
-        <w:ind w:left="720" w:hanging="360"/>
-        <w:rPr>
-          <w:u w:val="none"/>
-        </w:rPr>
-      </w:pPr>
-      <w:r>
-        <w:rPr>
-          <w:rtl w:val="0"/>
-        </w:rPr>
-        <w:t xml:space="preserve">Per rendere l’esecuzione dell’allenamento più veloce, si può dare la possibilità di non visualizzare la mappa di gioco</w:t>
-      </w:r>
-    </w:p>
-    <w:p>
-      <w:pPr>
-        <w:numPr>
-          <w:ilvl w:val="0"/>
-          <w:numId w:val="4"/>
-        </w:numPr>
-        <w:ind w:left="720" w:hanging="360"/>
-        <w:rPr>
-          <w:u w:val="none"/>
-        </w:rPr>
-      </w:pPr>
-      <w:r>
-        <w:rPr>
-          <w:rtl w:val="0"/>
-        </w:rPr>
-        <w:t xml:space="preserve">Permettere di inserire comandi durante l’allenamento dell’AI (es. comando per rendere visibile/non visibile la mappa)</w:t>
-      </w:r>
-    </w:p>
-    <w:p>
-      <w:pPr>
-        <w:numPr>
-          <w:ilvl w:val="0"/>
-          <w:numId w:val="4"/>
-        </w:numPr>
-        <w:ind w:left="720" w:hanging="360"/>
-        <w:rPr>
-          <w:u w:val="none"/>
-        </w:rPr>
-      </w:pPr>
-      <w:r>
-        <w:rPr>
-          <w:rtl w:val="0"/>
-        </w:rPr>
-        <w:t xml:space="preserve">Salvare più modelli di pesi e bias dell’AI attraverso file JSON</w:t>
-      </w:r>
-    </w:p>
-    <w:p>
-      <w:pPr>
-        <w:numPr>
-          <w:ilvl w:val="0"/>
-          <w:numId w:val="4"/>
-        </w:numPr>
-        <w:ind w:left="720" w:hanging="360"/>
-        <w:rPr>
-          <w:u w:val="none"/>
-        </w:rPr>
-      </w:pPr>
-      <w:r>
-        <w:rPr>
-          <w:rtl w:val="0"/>
-        </w:rPr>
-        <w:t xml:space="preserve">Si deve avere la possibilità di istanziare più AI che possano giocare a più partite di Snake contemporaneamente e che modificano contemporaneamente i pesi per tutti. Così facendo, il processo di allenamento viene accelerato.</w:t>
+        <w:br w:type="textWrapping"/>
+      </w:r>
+    </w:p>
+    <w:p>
+      <w:pPr>
+        <w:rPr/>
+      </w:pPr>
+      <w:r>
+        <w:rPr>
+          <w:rtl w:val="0"/>
+        </w:rPr>
+      </w:r>
+    </w:p>
+    <w:p>
+      <w:pPr>
+        <w:rPr/>
+      </w:pPr>
+      <w:r>
+        <w:rPr>
+          <w:rtl w:val="0"/>
+        </w:rPr>
+      </w:r>
+    </w:p>
+    <w:p>
+      <w:pPr>
+        <w:rPr/>
+      </w:pPr>
+      <w:r>
+        <w:rPr>
+          <w:rtl w:val="0"/>
+        </w:rPr>
+      </w:r>
+    </w:p>
+    <w:p>
+      <w:pPr>
+        <w:rPr>
+          <w:sz w:val="20"/>
+          <w:szCs w:val="20"/>
+        </w:rPr>
+      </w:pPr>
+      <w:r>
+        <w:rPr>
+          <w:rtl w:val="0"/>
+        </w:rPr>
+      </w:r>
+    </w:p>
+    <w:p>
+      <w:pPr>
+        <w:rPr>
+          <w:sz w:val="20"/>
+          <w:szCs w:val="20"/>
+        </w:rPr>
+      </w:pPr>
+      <w:r>
+        <w:rPr>
+          <w:rtl w:val="0"/>
+        </w:rPr>
       </w:r>
     </w:p>
     <w:p>
@@ -2243,7 +2467,7 @@
 
 <file path=word/comments.xml><?xml version="1.0" encoding="utf-8"?>
 <w:comments xmlns:mc="http://schemas.openxmlformats.org/markup-compatibility/2006" xmlns:o="urn:schemas-microsoft-com:office:office" xmlns:r="http://schemas.openxmlformats.org/officeDocument/2006/relationships" xmlns:m="http://schemas.openxmlformats.org/officeDocument/2006/math" xmlns:v="urn:schemas-microsoft-com:vml" xmlns:wp="http://schemas.openxmlformats.org/drawingml/2006/wordprocessingDrawing" xmlns:w10="urn:schemas-microsoft-com:office:word" xmlns:w="http://schemas.openxmlformats.org/wordprocessingml/2006/main" xmlns:wne="http://schemas.microsoft.com/office/word/2006/wordml" xmlns:sl="http://schemas.openxmlformats.org/schemaLibrary/2006/main" xmlns:a="http://schemas.openxmlformats.org/drawingml/2006/main" xmlns:pic="http://schemas.openxmlformats.org/drawingml/2006/picture" xmlns:c="http://schemas.openxmlformats.org/drawingml/2006/chart" xmlns:lc="http://schemas.openxmlformats.org/drawingml/2006/lockedCanvas" xmlns:dgm="http://schemas.openxmlformats.org/drawingml/2006/diagram" xmlns:wps="http://schemas.microsoft.com/office/word/2010/wordprocessingShape" xmlns:wpg="http://schemas.microsoft.com/office/word/2010/wordprocessingGroup" xmlns:w14="http://schemas.microsoft.com/office/word/2010/wordml" xmlns:w15="http://schemas.microsoft.com/office/word/2012/wordml" xmlns:w16="http://schemas.microsoft.com/office/word/2018/wordml" xmlns:w16cex="http://schemas.microsoft.com/office/word/2018/wordml/cex" xmlns:w16cid="http://schemas.microsoft.com/office/word/2016/wordml/cid" xmlns="http://schemas.microsoft.com/office/tasks/2019/documenttasks" xmlns:cr="http://schemas.microsoft.com/office/comments/2020/reactions">
-  <w:comment w:author="BRIAN GERVASONI" w:id="1" w:date="2025-11-15T10:44:41Z">
+  <w:comment w:author="Manuela Fiorentini" w:id="5" w:date="2025-11-18T10:02:03Z">
     <w:p>
       <w:pPr>
         <w:keepNext w:val="0"/>
@@ -2294,11 +2518,11 @@
           <w:vertAlign w:val="baseline"/>
           <w:rtl w:val="0"/>
         </w:rPr>
-        <w:t xml:space="preserve">(un man-in-the-middle oppure sia snake che l’ai aprono delle porte di comunicazione e usiamo quelle per comunicare?)</w:t>
+        <w:t xml:space="preserve">formula</w:t>
       </w:r>
     </w:p>
   </w:comment>
-  <w:comment w:author="Manuela Fiorentini" w:id="5" w:date="2025-11-18T10:02:03Z">
+  <w:comment w:author="Manuela Fiorentini" w:id="6" w:date="2025-11-18T10:04:53Z">
     <w:p>
       <w:pPr>
         <w:keepNext w:val="0"/>
@@ -2349,11 +2573,11 @@
           <w:vertAlign w:val="baseline"/>
           <w:rtl w:val="0"/>
         </w:rPr>
-        <w:t xml:space="preserve">formula</w:t>
+        <w:t xml:space="preserve">altra formula</w:t>
       </w:r>
     </w:p>
   </w:comment>
-  <w:comment w:author="Manuela Fiorentini" w:id="6" w:date="2025-11-18T10:04:53Z">
+  <w:comment w:author="Manuela Fiorentini" w:id="2" w:date="2025-11-18T09:48:35Z">
     <w:p>
       <w:pPr>
         <w:keepNext w:val="0"/>
@@ -2404,11 +2628,11 @@
           <w:vertAlign w:val="baseline"/>
           <w:rtl w:val="0"/>
         </w:rPr>
-        <w:t xml:space="preserve">altra formula</w:t>
+        <w:t xml:space="preserve">inserire altra formula con cui si ottiene il reward</w:t>
       </w:r>
     </w:p>
   </w:comment>
-  <w:comment w:author="Manuela Fiorentini" w:id="3" w:date="2025-11-18T09:48:35Z">
+  <w:comment w:author="Manuela Fiorentini" w:id="4" w:date="2025-11-18T10:01:58Z">
     <w:p>
       <w:pPr>
         <w:keepNext w:val="0"/>
@@ -2459,11 +2683,11 @@
           <w:vertAlign w:val="baseline"/>
           <w:rtl w:val="0"/>
         </w:rPr>
-        <w:t xml:space="preserve">inserire altra formula con cui si ottiene il reward</w:t>
+        <w:t xml:space="preserve">formula</w:t>
       </w:r>
     </w:p>
   </w:comment>
-  <w:comment w:author="Manuela Fiorentini" w:id="4" w:date="2025-11-18T10:01:58Z">
+  <w:comment w:author="Manuela Fiorentini" w:id="3" w:date="2025-11-24T13:36:39Z">
     <w:p>
       <w:pPr>
         <w:keepNext w:val="0"/>
@@ -2514,7 +2738,7 @@
           <w:vertAlign w:val="baseline"/>
           <w:rtl w:val="0"/>
         </w:rPr>
-        <w:t xml:space="preserve">formula</w:t>
+        <w:t xml:space="preserve">formule</w:t>
       </w:r>
     </w:p>
   </w:comment>
@@ -2573,7 +2797,7 @@
       </w:r>
     </w:p>
   </w:comment>
-  <w:comment w:author="Manuela Fiorentini" w:id="2" w:date="2025-11-18T09:27:54Z">
+  <w:comment w:author="Manuela Fiorentini" w:id="1" w:date="2025-11-18T09:27:54Z">
     <w:p>
       <w:pPr>
         <w:keepNext w:val="0"/>

</xml_diff>

<commit_message>
aggiornamento doc e inizio creazione classe layer
ho aggiornato l'uml di classe correggendo alcuni nomi e tipi di alcune variabili e iniziato la creazione della classe layer creando il costruttore e i getter e setter base
</commit_message>
<xml_diff>
--- a/docs/specificaReqSnake.docx
+++ b/docs/specificaReqSnake.docx
@@ -1759,6 +1759,24 @@
     </w:p>
     <w:p>
       <w:pPr>
+        <w:numPr>
+          <w:ilvl w:val="0"/>
+          <w:numId w:val="4"/>
+        </w:numPr>
+        <w:ind w:left="720" w:hanging="649.1338582677165"/>
+        <w:rPr>
+          <w:u w:val="none"/>
+        </w:rPr>
+      </w:pPr>
+      <w:r>
+        <w:rPr>
+          <w:rtl w:val="0"/>
+        </w:rPr>
+        <w:t xml:space="preserve">i bias e pesi, se non inizializzati, hanno un valore random tra -10 e 10</w:t>
+      </w:r>
+    </w:p>
+    <w:p>
+      <w:pPr>
         <w:ind w:left="720" w:firstLine="0"/>
         <w:rPr/>
       </w:pPr>
@@ -1884,7 +1902,7 @@
         <w:rPr>
           <w:rtl w:val="0"/>
         </w:rPr>
-        <w:t xml:space="preserve">Permettere di inserire comandi prima dell’allenamento dell’AI (inserire i valori dei hyperparametri, comando per rendere visibile/non visibile la mappal), necessario creare un box per i prompt.</w:t>
+        <w:t xml:space="preserve">Permettere di inserire comandi prima dell’allenamento dell’AI (inserire i valori dei hyperparametri, comando per rendere visibile/non visibile la mappa), necessario creare un box per i prompt.</w:t>
       </w:r>
     </w:p>
     <w:p>

</xml_diff>

<commit_message>
aggiornamento ing requisiti e diagramma uml
REQUISITI
- il fascio di rette per l'analisi della distanza tra head e oggetti sarà disposto nel seguente modo :
le rette avranno una differenza di fase tra loro di 3°, partendo d -90° fino a 90° per un totale di 60 rette

UML :
inserimento di interfaccia BoxType. Necessaria per l'uso di get e set di Box generici di cui non sappiamo se il tipo enum è snake, elemMap o food
</commit_message>
<xml_diff>
--- a/docs/specificaReqSnake.docx
+++ b/docs/specificaReqSnake.docx
@@ -1404,6 +1404,18 @@
           <w:rtl w:val="0"/>
         </w:rPr>
         <w:t xml:space="preserve">i.</w:t>
+      </w:r>
+    </w:p>
+    <w:p>
+      <w:pPr>
+        <w:ind w:left="720" w:firstLine="0"/>
+        <w:rPr/>
+      </w:pPr>
+      <w:r>
+        <w:rPr>
+          <w:rtl w:val="0"/>
+        </w:rPr>
+        <w:t xml:space="preserve">Le rette saranno disposte tra loro con una differenza di fase di 3° a partire dal angolo di -90° fino al angolo di 90°, in senso orario. Per un totale di 60 rette.</w:t>
       </w:r>
     </w:p>
     <w:p>

</xml_diff>

<commit_message>
documentazione della riunione 6/12/2025
</commit_message>
<xml_diff>
--- a/docs/specificaReqSnake.docx
+++ b/docs/specificaReqSnake.docx
@@ -710,7 +710,7 @@
         <w:rPr>
           <w:rtl w:val="0"/>
         </w:rPr>
-        <w:t xml:space="preserve">Verranno probabilmente fatte utilizzo di librerie matematiche esterne.</w:t>
+        <w:t xml:space="preserve">Verranno fatte utilizzo di librerie matematiche esterne come apache math3.</w:t>
       </w:r>
     </w:p>
     <w:p>
@@ -1195,7 +1195,7 @@
         <w:rPr>
           <w:rtl w:val="0"/>
         </w:rPr>
-        <w:t xml:space="preserve">La mappa ha una dimensione predefinita (esempio 10 x 10), non variabile</w:t>
+        <w:t xml:space="preserve">La mappa ha una dimensione predefinita (esempio 10 x 10), non variabile.</w:t>
       </w:r>
     </w:p>
     <w:p>
@@ -1213,6 +1213,24 @@
         <w:rPr>
           <w:rtl w:val="0"/>
         </w:rPr>
+        <w:t xml:space="preserve">La mappa avrà una dimensione uguale per ogni thread</w:t>
+      </w:r>
+    </w:p>
+    <w:p>
+      <w:pPr>
+        <w:numPr>
+          <w:ilvl w:val="0"/>
+          <w:numId w:val="4"/>
+        </w:numPr>
+        <w:ind w:left="720" w:hanging="649.1338582677165"/>
+        <w:rPr>
+          <w:u w:val="none"/>
+        </w:rPr>
+      </w:pPr>
+      <w:r>
+        <w:rPr>
+          <w:rtl w:val="0"/>
+        </w:rPr>
         <w:t xml:space="preserve">Il serpente avrà all’inizio solo la testa e una lunghezza di corpo</w:t>
       </w:r>
     </w:p>
@@ -1333,7 +1351,7 @@
         <w:rPr>
           <w:rtl w:val="0"/>
         </w:rPr>
-        <w:t xml:space="preserve">Quando la testa del serpente collide con una mela aumenta di 1 la lunghezza del corpo del serpente partendo dalla coda</w:t>
+        <w:t xml:space="preserve">Quando la testa del serpente collide con una mela aumenta di 1 la lunghezza del corpo del serpente partendo dalla coda.</w:t>
       </w:r>
     </w:p>
     <w:p>
@@ -1415,7 +1433,7 @@
         <w:rPr>
           <w:rtl w:val="0"/>
         </w:rPr>
-        <w:t xml:space="preserve">Le rette saranno disposte tra loro con una differenza di fase di 3° a partire dal angolo di -90° fino al angolo di 90°, in senso orario. Per un totale di 60 rette.</w:t>
+        <w:t xml:space="preserve">Le rette saranno disposte tra loro con una differenza di fase di 3° e copriranno un’ampiezza di 180 gradi, in senso orario. Per un totale di 61 semirette.</w:t>
       </w:r>
     </w:p>
     <w:p>
@@ -1433,7 +1451,7 @@
         <w:rPr>
           <w:rtl w:val="0"/>
         </w:rPr>
-        <w:t xml:space="preserve">L’interprete definisce un numero finito di rette che utilizzerà per passare in input all’intelligenza la distanza calcolata in precedenza</w:t>
+        <w:t xml:space="preserve">L’interprete definisce un numero finito di semirette che utilizzerà per passare in input all’intelligenza la distanza calcolata in precedenza</w:t>
       </w:r>
     </w:p>
     <w:p>
@@ -1479,7 +1497,7 @@
         <w:rPr>
           <w:rtl w:val="0"/>
         </w:rPr>
-        <w:t xml:space="preserve">l’interprete gestisce la comunicazione tra i thread AI e di gioco.</w:t>
+        <w:t xml:space="preserve">L’interprete gestisce la comunicazione tra i thread AI e di gioco.</w:t>
       </w:r>
     </w:p>
     <w:p>
@@ -1530,7 +1548,25 @@
         <w:rPr>
           <w:rtl w:val="0"/>
         </w:rPr>
-        <w:t xml:space="preserve">delle statistiche di gioco</w:t>
+        <w:t xml:space="preserve">delle statistiche di gioco: media loss, media rewards.</w:t>
+      </w:r>
+    </w:p>
+    <w:p>
+      <w:pPr>
+        <w:numPr>
+          <w:ilvl w:val="0"/>
+          <w:numId w:val="4"/>
+        </w:numPr>
+        <w:ind w:left="720" w:hanging="649.1338582677165"/>
+        <w:rPr>
+          <w:u w:val="none"/>
+        </w:rPr>
+      </w:pPr>
+      <w:r>
+        <w:rPr>
+          <w:rtl w:val="0"/>
+        </w:rPr>
+        <w:t xml:space="preserve">I vari thread possono mandare le statistiche in maniera asincrona.</w:t>
       </w:r>
     </w:p>
     <w:p>
@@ -1571,7 +1607,7 @@
         <w:rPr>
           <w:rtl w:val="0"/>
         </w:rPr>
-        <w:t xml:space="preserve">La quantità di layer e loro personalizzazione deve essere inserito nella sua inizializzazione</w:t>
+        <w:t xml:space="preserve">La quantità di layer e la loro personalizzazione può essere inserito nella sua inizializzazione, oppure la lunghezza dei vari layer.</w:t>
       </w:r>
     </w:p>
     <w:p>
@@ -1784,11 +1820,65 @@
         <w:rPr>
           <w:rtl w:val="0"/>
         </w:rPr>
+        <w:t xml:space="preserve">Si può scegliere tra gradient ascend e gradient descent nel gradient update.</w:t>
+      </w:r>
+    </w:p>
+    <w:p>
+      <w:pPr>
+        <w:numPr>
+          <w:ilvl w:val="0"/>
+          <w:numId w:val="4"/>
+        </w:numPr>
+        <w:ind w:left="720" w:hanging="649.1338582677165"/>
+        <w:rPr>
+          <w:u w:val="none"/>
+        </w:rPr>
+      </w:pPr>
+      <w:r>
+        <w:rPr>
+          <w:rtl w:val="0"/>
+        </w:rPr>
         <w:t xml:space="preserve">i bias e pesi, se non inizializzati, hanno un valore random tra -10 e 10</w:t>
       </w:r>
     </w:p>
     <w:p>
       <w:pPr>
+        <w:numPr>
+          <w:ilvl w:val="0"/>
+          <w:numId w:val="4"/>
+        </w:numPr>
+        <w:ind w:left="720" w:hanging="649.1338582677165"/>
+        <w:rPr>
+          <w:u w:val="none"/>
+        </w:rPr>
+      </w:pPr>
+      <w:r>
+        <w:rPr>
+          <w:rtl w:val="0"/>
+        </w:rPr>
+        <w:t xml:space="preserve">Ogni layer t contiene i pesi tra il layer t e il layer t-1.</w:t>
+      </w:r>
+    </w:p>
+    <w:p>
+      <w:pPr>
+        <w:numPr>
+          <w:ilvl w:val="0"/>
+          <w:numId w:val="4"/>
+        </w:numPr>
+        <w:ind w:left="720" w:hanging="649.1338582677165"/>
+        <w:rPr>
+          <w:u w:val="none"/>
+        </w:rPr>
+      </w:pPr>
+      <w:r>
+        <w:rPr>
+          <w:rtl w:val="0"/>
+        </w:rPr>
+        <w:t xml:space="preserve">Gli iperparametri sono uguali per ogni modello.</w:t>
+      </w:r>
+    </w:p>
+    <w:p>
+      <w:pPr>
         <w:ind w:left="720" w:firstLine="0"/>
         <w:rPr/>
       </w:pPr>
@@ -1843,7 +1933,7 @@
         <w:rPr>
           <w:rtl w:val="0"/>
         </w:rPr>
-        <w:t xml:space="preserve">Si deve avere la possibilità di istanziare più AI che possano giocare a più partite di Snake contemporaneamente e che modificano contemporaneamente i pesi per tutti. Così facendo, il processo di allenamento viene accelerato.</w:t>
+        <w:t xml:space="preserve">Si deve avere la possibilità di istanziare più AI che possano giocare a più partite di Snake contemporaneamente e che modificano contemporaneamente i pesi per tutti.</w:t>
       </w:r>
     </w:p>
     <w:p>
@@ -1858,7 +1948,7 @@
         <w:rPr>
           <w:rtl w:val="0"/>
         </w:rPr>
-        <w:t xml:space="preserve">L’AI avrà due set di neuroni di input. Uno riceve in input i valori delle rette che si scontrano con il corpo e/o il muro (aree che deve evitare). L’altro set riceverà i valori delle rette che si scontrano con la mela (area che vuole raggiungere)</w:t>
+        <w:t xml:space="preserve">L’AI avrà due set di neuroni di input. Uno riceve in input i valori delle rette che si scontrano con il corpo e/o il muro (aree che deve evitare). L’altro set riceverà i valori delle semirette che si scontrano con la mela (area che vuole raggiungere)</w:t>
       </w:r>
     </w:p>
     <w:p>
@@ -1881,6 +1971,24 @@
     </w:p>
     <w:p>
       <w:pPr>
+        <w:numPr>
+          <w:ilvl w:val="0"/>
+          <w:numId w:val="4"/>
+        </w:numPr>
+        <w:ind w:left="720" w:hanging="649.1338582677165"/>
+        <w:rPr>
+          <w:u w:val="none"/>
+        </w:rPr>
+      </w:pPr>
+      <w:r>
+        <w:rPr>
+          <w:rtl w:val="0"/>
+        </w:rPr>
+        <w:t xml:space="preserve">La grandezza del minibatch deve essere minore o uguale al numero di thread * T</w:t>
+      </w:r>
+    </w:p>
+    <w:p>
+      <w:pPr>
         <w:ind w:left="720" w:firstLine="0"/>
         <w:rPr/>
       </w:pPr>
@@ -1914,7 +2022,7 @@
         <w:rPr>
           <w:rtl w:val="0"/>
         </w:rPr>
-        <w:t xml:space="preserve">Permettere di inserire comandi prima dell’allenamento dell’AI (inserire i valori dei hyperparametri, comando per rendere visibile/non visibile la mappa), necessario creare un box per i prompt.</w:t>
+        <w:t xml:space="preserve">Permettere di inserire comandi prima dell’allenamento dell’AI (inserire i valori dei iperparametri, comando per rendere visibile/non visibile la mappa), necessario creare un box per i prompt.</w:t>
       </w:r>
     </w:p>
     <w:p>
@@ -1932,7 +2040,7 @@
         <w:rPr>
           <w:rtl w:val="0"/>
         </w:rPr>
-        <w:t xml:space="preserve">Cambiare da fase training/learning (fase in cui l’AI apprende, avvengono la front e la back propagation) a fase execution (fase in cui gioca) e viceversa. Durante il cambio fase avviene il salvataggio dello stato attuale dell’apprendimento dell’AI (ovvero del modulo).</w:t>
+        <w:t xml:space="preserve">Cambiare da fase training/learning (fase in cui l’AI apprende, avvengono la front e la backpropagation) a fase execution (fase in cui gioca) e viceversa. Durante il cambio fase avviene il salvataggio dello stato attuale dell’apprendimento dell’AI (ovvero del modulo).</w:t>
       </w:r>
     </w:p>
     <w:p>
@@ -1973,6 +2081,42 @@
     </w:p>
     <w:p>
       <w:pPr>
+        <w:numPr>
+          <w:ilvl w:val="0"/>
+          <w:numId w:val="4"/>
+        </w:numPr>
+        <w:ind w:left="720" w:hanging="649.1338582677165"/>
+        <w:rPr>
+          <w:u w:val="none"/>
+        </w:rPr>
+      </w:pPr>
+      <w:r>
+        <w:rPr>
+          <w:rtl w:val="0"/>
+        </w:rPr>
+        <w:t xml:space="preserve">Prima dell’inizio della fase di training l’utente inserisce il numero di thread che vuole assegnare all’allenamento.</w:t>
+      </w:r>
+    </w:p>
+    <w:p>
+      <w:pPr>
+        <w:numPr>
+          <w:ilvl w:val="0"/>
+          <w:numId w:val="4"/>
+        </w:numPr>
+        <w:ind w:left="720" w:hanging="649.1338582677165"/>
+        <w:rPr>
+          <w:u w:val="none"/>
+        </w:rPr>
+      </w:pPr>
+      <w:r>
+        <w:rPr>
+          <w:rtl w:val="0"/>
+        </w:rPr>
+        <w:t xml:space="preserve">Durante la fase di esecuzione il gioco viene rallentato ad un’azione per 1 secondo.</w:t>
+      </w:r>
+    </w:p>
+    <w:p>
+      <w:pPr>
         <w:ind w:left="0" w:firstLine="0"/>
         <w:rPr/>
       </w:pPr>
@@ -1982,20 +2126,78 @@
         </w:rPr>
         <w:br w:type="textWrapping"/>
       </w:r>
-    </w:p>
-    <w:p>
-      <w:pPr>
-        <w:rPr/>
-      </w:pPr>
-      <w:r>
-        <w:rPr>
-          <w:rtl w:val="0"/>
-        </w:rPr>
-      </w:r>
-    </w:p>
-    <w:p>
-      <w:pPr>
-        <w:rPr/>
+      <w:hyperlink r:id="rId7">
+        <w:r>
+          <w:rPr/>
+          <w:drawing>
+            <wp:inline distB="19050" distT="19050" distL="19050" distR="19050">
+              <wp:extent cx="2185988" cy="219820"/>
+              <wp:effectExtent b="0" l="0" r="0" t="0"/>
+              <wp:docPr id="1" name="image1.png"/>
+              <a:graphic>
+                <a:graphicData uri="http://schemas.openxmlformats.org/drawingml/2006/picture">
+                  <pic:pic>
+                    <pic:nvPicPr>
+                      <pic:cNvPr id="0" name="image1.png"/>
+                      <pic:cNvPicPr preferRelativeResize="0"/>
+                    </pic:nvPicPr>
+                    <pic:blipFill>
+                      <a:blip r:embed="rId8"/>
+                      <a:srcRect b="0" l="0" r="0" t="0"/>
+                      <a:stretch>
+                        <a:fillRect/>
+                      </a:stretch>
+                    </pic:blipFill>
+                    <pic:spPr>
+                      <a:xfrm>
+                        <a:off x="0" y="0"/>
+                        <a:ext cx="2185988" cy="219820"/>
+                      </a:xfrm>
+                      <a:prstGeom prst="rect"/>
+                      <a:ln/>
+                    </pic:spPr>
+                  </pic:pic>
+                </a:graphicData>
+              </a:graphic>
+            </wp:inline>
+          </w:drawing>
+        </w:r>
+      </w:hyperlink>
+      <w:r>
+        <w:rPr>
+          <w:rtl w:val="0"/>
+        </w:rPr>
+      </w:r>
+    </w:p>
+    <w:p>
+      <w:pPr>
+        <w:rPr/>
+      </w:pPr>
+      <w:r>
+        <w:rPr>
+          <w:rtl w:val="0"/>
+        </w:rPr>
+      </w:r>
+    </w:p>
+    <w:p>
+      <w:pPr>
+        <w:rPr>
+          <w:sz w:val="24"/>
+          <w:szCs w:val="24"/>
+        </w:rPr>
+      </w:pPr>
+      <w:r>
+        <w:rPr>
+          <w:rtl w:val="0"/>
+        </w:rPr>
+      </w:r>
+    </w:p>
+    <w:p>
+      <w:pPr>
+        <w:rPr>
+          <w:sz w:val="24"/>
+          <w:szCs w:val="24"/>
+        </w:rPr>
       </w:pPr>
       <w:r>
         <w:rPr>

</xml_diff>